<commit_message>
Finalizing public deployment build v1.2
</commit_message>
<xml_diff>
--- a/Documentation/Major Project Report/Shazali Chapter 2 Major Project Edited - Copy.docx
+++ b/Documentation/Major Project Report/Shazali Chapter 2 Major Project Edited - Copy.docx
@@ -3910,10 +3910,7 @@
       </w:pPr>
       <w:r>
         <w:lastRenderedPageBreak/>
-        <w:t xml:space="preserve">  </w:t>
-      </w:r>
-      <w:r>
-        <w:t>CHAPTER</w:t>
+        <w:t xml:space="preserve">  CHAPTER</w:t>
       </w:r>
       <w:r>
         <w:rPr>
@@ -4070,13 +4067,7 @@
         <w:t xml:space="preserve"> </w:t>
       </w:r>
       <w:r>
-        <w:t>and understand the capabilities of existing antivirus software and malware. To understand the evolution of malware and the improvements of antivirus software to combat such cyber threats, a thorough review of existing literature will give an insight on the development, evaluation and current capabilities of antivirus solution</w:t>
-      </w:r>
-      <w:r>
-        <w:t>s</w:t>
-      </w:r>
-      <w:r>
-        <w:t xml:space="preserve"> in the context of combating cyber threats.</w:t>
+        <w:t>and understand the capabilities of existing antivirus software and malware. To understand the evolution of malware and the improvements of antivirus software to combat such cyber threats, a thorough review of existing literature will give an insight on the development, evaluation and current capabilities of antivirus solutions in the context of combating cyber threats.</w:t>
       </w:r>
     </w:p>
     <w:p>
@@ -4087,19 +4078,7 @@
         <w:jc w:val="both"/>
       </w:pPr>
       <w:r>
-        <w:t>This chapter is organized thematically to cover key areas of antivirus so</w:t>
-      </w:r>
-      <w:r>
-        <w:t>ftware evaluation which include</w:t>
-      </w:r>
-      <w:r>
-        <w:t xml:space="preserve"> system performance, threat detection. However, before delving into reviewing the following studies, this chapter will first outline the theoretical frameworks that will support the study’s focus on cybersecurity effectiveness and </w:t>
-      </w:r>
-      <w:r>
-        <w:t>hardware performance</w:t>
-      </w:r>
-      <w:r>
-        <w:t xml:space="preserve"> evaluation.</w:t>
+        <w:t>This chapter is organized thematically to cover key areas of antivirus software evaluation which include system performance, threat detection. However, before delving into reviewing the following studies, this chapter will first outline the theoretical frameworks that will support the study’s focus on cybersecurity effectiveness and hardware performance evaluation.</w:t>
       </w:r>
     </w:p>
     <w:p>
@@ -6869,12 +6848,7 @@
         <w:t xml:space="preserve"> </w:t>
       </w:r>
       <w:r>
-        <w:t xml:space="preserve">based on comparative insights drawn </w:t>
-      </w:r>
-      <w:bookmarkStart w:id="0" w:name="_GoBack"/>
-      <w:bookmarkEnd w:id="0"/>
-      <w:r>
-        <w:t>from the previously</w:t>
+        <w:t>based on comparative insights drawn from the previously</w:t>
       </w:r>
       <w:r>
         <w:rPr>
@@ -6959,7 +6933,10 @@
       </w:r>
       <w:r>
         <w:lastRenderedPageBreak/>
-        <w:t>following chapters, guiding both the technical assessment and user-centered comparison of antivirus performance.</w:t>
+        <w:t xml:space="preserve">following chapters, guiding both the technical assessment and </w:t>
+      </w:r>
+      <w:r>
+        <w:t>hardware performance.</w:t>
       </w:r>
     </w:p>
     <w:p>
@@ -6982,22 +6959,16 @@
     <w:p>
       <w:pPr>
         <w:pStyle w:val="BodyText"/>
-        <w:spacing w:line="357" w:lineRule="auto"/>
-        <w:ind w:right="303"/>
+        <w:spacing w:before="240" w:after="240" w:line="357" w:lineRule="auto"/>
+        <w:ind w:left="0" w:right="303"/>
         <w:jc w:val="both"/>
       </w:pPr>
+      <w:bookmarkStart w:id="0" w:name="_GoBack"/>
+      <w:r>
+        <w:t xml:space="preserve">In addition to academic literature, there exists independent organizations such as AV-Comparatives, AV-Test and SE Labs which conducts large-scale antivirus benchmarking. For example, AV-Comparatives recently published a report regarding Real-World Protection Test (February – May 2025) which assessed 19 consumer security solutions and evaluating their protection performance under realistic conditions which included malicious URLs, downloads and zero day threats which produced a result of Bitdefender achieving the top protection rate of 99.8% while Microsoft Defender managed to produce a protection rate of 99.1% (AV-Comparatives, 2025). This real-world benchmarking underlines that built-in antivirus capabilities have dramatically improved and can compete with third party antivirus solutions. However, these tests focus on purely on technical aspects of antiviruses and largely ignore usability factors. Another thing to consider is that the testing methods is not made available to the public and is only defined in the report. Thus, while independent organizations such as AV-Comparatives establishes industry-standard baselines, this project differentiates itself by combining detection metrics with usability and performance trade-off analysis while ensuring its transparent and open source tailoring to everyday users choosing between built-ion and third party antivirus solutions.  </w:t>
+      </w:r>
     </w:p>
-    <w:p>
-      <w:pPr>
-        <w:pStyle w:val="BodyText"/>
-        <w:spacing w:after="240" w:line="357" w:lineRule="auto"/>
-        <w:ind w:right="303"/>
-        <w:jc w:val="both"/>
-      </w:pPr>
-      <w:r>
-        <w:t xml:space="preserve">In addition to academic literature, there exists independent organizations such as AV-Comparatives, AV-Test and SE Labs which conducts large-scale antivirus benchmarking. For example, AV-Comparatives recently published a report regarding Real-World Protection Test (February – May 2025) which assessed 19 consumer security solutions and evaluating their protection performance under realistic conditions which included malicious URLs, downloads and zero day threats which produced a result of Bitdefender achieving the top protection rate of 99.8% while Microsoft Defender managed to produce a protection rate of 99.1% (AV-Comparatives, 2025). This real-world benchmarking underlines that built-in antivirus capabilities have dramatically improved and can compete with third party antivirus solutions. However, these tests focus on purely on technical aspects of antiviruses and largely ignore usability factors. Another thing to consider is that the testing methods is not made available to the public and is only defined in the report. Thus, while independent organizations such as AV-Comparatives establishes industry-standard baselines, this project differentiates itself by combining detection metrics with usability and performance trade-off analysis while ensuring its transparent and open source tailoring to everyday users choosing between built-ion and third party antivirus solutions.  </w:t>
-      </w:r>
-    </w:p>
+    <w:bookmarkEnd w:id="0"/>
     <w:p>
       <w:pPr>
         <w:pStyle w:val="Heading1"/>
@@ -7650,11 +7621,7 @@
         <w:t xml:space="preserve"> </w:t>
       </w:r>
       <w:r>
-        <w:t xml:space="preserve">users. </w:t>
-      </w:r>
-      <w:r>
-        <w:lastRenderedPageBreak/>
-        <w:t>The</w:t>
+        <w:t>users. The</w:t>
       </w:r>
       <w:r>
         <w:rPr>
@@ -7782,6 +7749,7 @@
           <w:sz w:val="24"/>
           <w:szCs w:val="24"/>
         </w:rPr>
+        <w:lastRenderedPageBreak/>
         <w:t>w</w:t>
       </w:r>
       <w:r>
@@ -8829,11 +8797,11 @@
         <w:t xml:space="preserve"> </w:t>
       </w:r>
       <w:r>
-        <w:t xml:space="preserve">real time pushed the industry to </w:t>
+        <w:t xml:space="preserve">real time pushed the industry to evolve and develop NGAV. Organizations such as IBM, Microsoft and Threatdown has steadily </w:t>
       </w:r>
       <w:r>
         <w:lastRenderedPageBreak/>
-        <w:t>evolve and develop NGAV. Organizations such as IBM, Microsoft and Threatdown has steadily implement NGAV into their antivirus solutions to further improve their defenses against cyber threats.</w:t>
+        <w:t>implement NGAV into their antivirus solutions to further improve their defenses against cyber threats.</w:t>
       </w:r>
       <w:r>
         <w:rPr>
@@ -10082,101 +10050,101 @@
         <w:t xml:space="preserve"> </w:t>
       </w:r>
       <w:r>
-        <w:t xml:space="preserve">following </w:t>
+        <w:t>following studies.</w:t>
+      </w:r>
+      <w:r>
+        <w:rPr>
+          <w:spacing w:val="-8"/>
+        </w:rPr>
+        <w:t xml:space="preserve"> </w:t>
+      </w:r>
+      <w:r>
+        <w:t>For</w:t>
+      </w:r>
+      <w:r>
+        <w:rPr>
+          <w:spacing w:val="-12"/>
+        </w:rPr>
+        <w:t xml:space="preserve"> </w:t>
+      </w:r>
+      <w:r>
+        <w:t>example,</w:t>
+      </w:r>
+      <w:r>
+        <w:rPr>
+          <w:spacing w:val="-14"/>
+        </w:rPr>
+        <w:t xml:space="preserve"> </w:t>
+      </w:r>
+      <w:r>
+        <w:t>Delaney</w:t>
+      </w:r>
+      <w:r>
+        <w:rPr>
+          <w:spacing w:val="-11"/>
+        </w:rPr>
+        <w:t xml:space="preserve"> </w:t>
+      </w:r>
+      <w:r>
+        <w:t>(2020)</w:t>
+      </w:r>
+      <w:r>
+        <w:rPr>
+          <w:spacing w:val="-12"/>
+        </w:rPr>
+        <w:t xml:space="preserve"> </w:t>
+      </w:r>
+      <w:r>
+        <w:t>comprehensively</w:t>
+      </w:r>
+      <w:r>
+        <w:rPr>
+          <w:spacing w:val="-11"/>
+        </w:rPr>
+        <w:t xml:space="preserve"> </w:t>
+      </w:r>
+      <w:r>
+        <w:t>reviewed</w:t>
+      </w:r>
+      <w:r>
+        <w:rPr>
+          <w:spacing w:val="-11"/>
+        </w:rPr>
+        <w:t xml:space="preserve"> </w:t>
+      </w:r>
+      <w:r>
+        <w:t>and</w:t>
+      </w:r>
+      <w:r>
+        <w:rPr>
+          <w:spacing w:val="-11"/>
+        </w:rPr>
+        <w:t xml:space="preserve"> </w:t>
+      </w:r>
+      <w:r>
+        <w:t>evaluated</w:t>
+      </w:r>
+      <w:r>
+        <w:rPr>
+          <w:spacing w:val="-11"/>
+        </w:rPr>
+        <w:t xml:space="preserve"> </w:t>
+      </w:r>
+      <w:r>
+        <w:t>detection</w:t>
+      </w:r>
+      <w:r>
+        <w:rPr>
+          <w:spacing w:val="-15"/>
+        </w:rPr>
+        <w:t xml:space="preserve"> </w:t>
+      </w:r>
+      <w:r>
+        <w:t xml:space="preserve">methods </w:t>
       </w:r>
       <w:r>
         <w:lastRenderedPageBreak/>
-        <w:t>studies.</w:t>
-      </w:r>
-      <w:r>
-        <w:rPr>
-          <w:spacing w:val="-8"/>
-        </w:rPr>
-        <w:t xml:space="preserve"> </w:t>
-      </w:r>
-      <w:r>
-        <w:t>For</w:t>
-      </w:r>
-      <w:r>
-        <w:rPr>
-          <w:spacing w:val="-12"/>
-        </w:rPr>
-        <w:t xml:space="preserve"> </w:t>
-      </w:r>
-      <w:r>
-        <w:t>example,</w:t>
-      </w:r>
-      <w:r>
-        <w:rPr>
-          <w:spacing w:val="-14"/>
-        </w:rPr>
-        <w:t xml:space="preserve"> </w:t>
-      </w:r>
-      <w:r>
-        <w:t>Delaney</w:t>
-      </w:r>
-      <w:r>
-        <w:rPr>
-          <w:spacing w:val="-11"/>
-        </w:rPr>
-        <w:t xml:space="preserve"> </w:t>
-      </w:r>
-      <w:r>
-        <w:t>(2020)</w:t>
-      </w:r>
-      <w:r>
-        <w:rPr>
-          <w:spacing w:val="-12"/>
-        </w:rPr>
-        <w:t xml:space="preserve"> </w:t>
-      </w:r>
-      <w:r>
-        <w:t>comprehensively</w:t>
-      </w:r>
-      <w:r>
-        <w:rPr>
-          <w:spacing w:val="-11"/>
-        </w:rPr>
-        <w:t xml:space="preserve"> </w:t>
-      </w:r>
-      <w:r>
-        <w:t>reviewed</w:t>
-      </w:r>
-      <w:r>
-        <w:rPr>
-          <w:spacing w:val="-11"/>
-        </w:rPr>
-        <w:t xml:space="preserve"> </w:t>
-      </w:r>
-      <w:r>
-        <w:t>and</w:t>
-      </w:r>
-      <w:r>
-        <w:rPr>
-          <w:spacing w:val="-11"/>
-        </w:rPr>
-        <w:t xml:space="preserve"> </w:t>
-      </w:r>
-      <w:r>
-        <w:t>evaluated</w:t>
-      </w:r>
-      <w:r>
-        <w:rPr>
-          <w:spacing w:val="-11"/>
-        </w:rPr>
-        <w:t xml:space="preserve"> </w:t>
-      </w:r>
-      <w:r>
-        <w:t>detection</w:t>
-      </w:r>
-      <w:r>
-        <w:rPr>
-          <w:spacing w:val="-15"/>
-        </w:rPr>
-        <w:t xml:space="preserve"> </w:t>
-      </w:r>
-      <w:r>
-        <w:t>methods of antivirus solutions and the performance of Microsoft Defender, but the study does not explore how non-technical users perceive its usability or whether its limitations justify purchasing third- party</w:t>
+        <w:t>of antivirus solutions and the performance of Microsoft Defender, but the study does not explore how non-technical users perceive its usability or whether its limitations justify purchasing third- party</w:t>
       </w:r>
       <w:r>
         <w:rPr>
@@ -10921,7 +10889,7 @@
           <w:rPr>
             <w:noProof/>
           </w:rPr>
-          <w:t>14</w:t>
+          <w:t>12</w:t>
         </w:r>
         <w:r>
           <w:rPr>

</xml_diff>